<commit_message>
Testing done , worked well
</commit_message>
<xml_diff>
--- a/ABC-2024-0421_Device_Form.docx
+++ b/ABC-2024-0421_Device_Form.docx
@@ -71,7 +71,7 @@
           </w:tcPr>
           <w:p>
             <w:r>
-              <w:t xml:space="preserve">Yash Sharma </w:t>
+              <w:t>Yash Sharma</w:t>
             </w:r>
           </w:p>
         </w:tc>
@@ -333,68 +333,6 @@
           </w:p>
         </w:tc>
       </w:tr>
-      <w:tr>
-        <w:tc>
-          <w:tcPr>
-            <w:tcW w:type="dxa" w:w="1440"/>
-          </w:tcPr>
-          <w:p>
-            <w:r>
-              <w:t>2</w:t>
-            </w:r>
-          </w:p>
-        </w:tc>
-        <w:tc>
-          <w:tcPr>
-            <w:tcW w:type="dxa" w:w="1440"/>
-          </w:tcPr>
-          <w:p>
-            <w:r>
-              <w:t>Charger</w:t>
-            </w:r>
-          </w:p>
-        </w:tc>
-        <w:tc>
-          <w:tcPr>
-            <w:tcW w:type="dxa" w:w="1440"/>
-          </w:tcPr>
-          <w:p>
-            <w:r>
-              <w:t>Dell 65W USB-C</w:t>
-            </w:r>
-          </w:p>
-        </w:tc>
-        <w:tc>
-          <w:tcPr>
-            <w:tcW w:type="dxa" w:w="1440"/>
-          </w:tcPr>
-          <w:p>
-            <w:r>
-              <w:t>CH-SN-112233</w:t>
-            </w:r>
-          </w:p>
-        </w:tc>
-        <w:tc>
-          <w:tcPr>
-            <w:tcW w:type="dxa" w:w="1440"/>
-          </w:tcPr>
-          <w:p>
-            <w:r>
-              <w:t>Good</w:t>
-            </w:r>
-          </w:p>
-        </w:tc>
-        <w:tc>
-          <w:tcPr>
-            <w:tcW w:type="dxa" w:w="1440"/>
-          </w:tcPr>
-          <w:p>
-            <w:r>
-              <w:t>—</w:t>
-            </w:r>
-          </w:p>
-        </w:tc>
-      </w:tr>
     </w:tbl>
     <w:p>
       <w:pPr>
@@ -431,7 +369,7 @@
           </w:tcPr>
           <w:p>
             <w:r>
-              <w:t>2026-04-15 00:00:00</w:t>
+              <w:t>15-May-2025</w:t>
             </w:r>
           </w:p>
         </w:tc>
@@ -453,7 +391,7 @@
           </w:tcPr>
           <w:p>
             <w:r>
-              <w:t>2026-06-15 00:00:00</w:t>
+              <w:t>15-Jun-2025</w:t>
             </w:r>
           </w:p>
         </w:tc>

</xml_diff>